<commit_message>
Simplify the links document to a description plus the link
Each item is now a short line saying what the link is, followed by the URL.
Also written out as deliverables/SUBMISSION-LINKS.md.

Co-Authored-By: Claude Opus 5 (1M context) <noreply@anthropic.com>
Claude-Session: https://claude.ai/code/session_0136Z8nV3v7dTo2gFEgHQphw
</commit_message>
<xml_diff>
--- a/deliverables/docx/00-Submission-Links.docx
+++ b/deliverables/docx/00-Submission-Links.docx
@@ -2,7 +2,7 @@
 <file path=word/document.xml><?xml version="1.0" encoding="utf-8"?>
 <w:document xmlns:w="http://schemas.openxmlformats.org/wordprocessingml/2006/main" xmlns:m="http://schemas.openxmlformats.org/officeDocument/2006/math" xmlns:r="http://schemas.openxmlformats.org/officeDocument/2006/relationships" xmlns:o="urn:schemas-microsoft-com:office:office" xmlns:v="urn:schemas-microsoft-com:vml" xmlns:w10="urn:schemas-microsoft-com:office:word" xmlns:a="http://schemas.openxmlformats.org/drawingml/2006/main" xmlns:pic="http://schemas.openxmlformats.org/drawingml/2006/picture" xmlns:wp="http://schemas.openxmlformats.org/drawingml/2006/wordprocessingDrawing">
   <w:body>
-    <w:bookmarkStart w:id="38" w:name="capstone-submission-deliverable-links"/>
+    <w:bookmarkStart w:id="48" w:name="capstone-submission-deliverable-links"/>
     <w:p>
       <w:pPr>
         <w:pStyle w:val="Heading1"/>
@@ -45,688 +45,107 @@
         <w:t xml:space="preserve">All links are public and were verified as reachable without sign-in.</w:t>
       </w:r>
     </w:p>
-    <w:bookmarkStart w:id="34" w:name="folders"/>
+    <w:bookmarkStart w:id="34" w:name="everything-in-one-folder"/>
     <w:p>
       <w:pPr>
         <w:pStyle w:val="Heading2"/>
       </w:pPr>
       <w:r>
-        <w:t xml:space="preserve">Folders</w:t>
-      </w:r>
-    </w:p>
-    <w:tbl>
-      <w:tblPr>
-        <w:tblStyle w:val="Table"/>
-        <w:tblW w:type="pct" w:w="5000"/>
-        <w:tblLayout w:type="fixed"/>
-        <w:tblLook w:firstRow="1" w:lastRow="0" w:firstColumn="0" w:lastColumn="0" w:noHBand="0" w:noVBand="0" w:val="0020"/>
-      </w:tblPr>
-      <w:tblGrid>
-        <w:gridCol w:w="3960"/>
-        <w:gridCol w:w="3960"/>
-      </w:tblGrid>
-      <w:tr>
-        <w:trPr>
-          <w:tblHeader w:val="on"/>
-        </w:trPr>
-        <w:tc>
-          <w:tcPr/>
-          <w:p>
-            <w:pPr>
-              <w:pStyle w:val="Compact"/>
-            </w:pPr>
-            <w:r>
-              <w:t xml:space="preserve">Folder</w:t>
-            </w:r>
-          </w:p>
-        </w:tc>
-        <w:tc>
-          <w:tcPr/>
-          <w:p>
-            <w:pPr>
-              <w:pStyle w:val="Compact"/>
-            </w:pPr>
-            <w:r>
-              <w:t xml:space="preserve">Link</w:t>
-            </w:r>
-          </w:p>
-        </w:tc>
-      </w:tr>
-      <w:tr>
-        <w:tc>
-          <w:tcPr/>
-          <w:p>
-            <w:pPr>
-              <w:pStyle w:val="Compact"/>
-            </w:pPr>
-            <w:r>
-              <w:t xml:space="preserve">Everything</w:t>
-            </w:r>
-          </w:p>
-        </w:tc>
-        <w:tc>
-          <w:tcPr/>
-          <w:p>
-            <w:pPr>
-              <w:pStyle w:val="Compact"/>
-            </w:pPr>
-            <w:r>
-              <w:t xml:space="preserve">https://drive.google.com/drive/folders/1PHvCCxlbwqVEkERlko8-6yZZoImmf0tR</w:t>
-            </w:r>
-          </w:p>
-        </w:tc>
-      </w:tr>
-      <w:tr>
-        <w:tc>
-          <w:tcPr/>
-          <w:p>
-            <w:pPr>
-              <w:pStyle w:val="Compact"/>
-            </w:pPr>
-            <w:r>
-              <w:t xml:space="preserve">Final presentation</w:t>
-            </w:r>
-          </w:p>
-        </w:tc>
-        <w:tc>
-          <w:tcPr/>
-          <w:p>
-            <w:pPr>
-              <w:pStyle w:val="Compact"/>
-            </w:pPr>
-            <w:r>
-              <w:t xml:space="preserve">https://drive.google.com/drive/folders/1AkWdO5NlaqnFkACs2HIfIl3gmAMfs1w_</w:t>
-            </w:r>
-          </w:p>
-        </w:tc>
-      </w:tr>
-    </w:tbl>
+        <w:t xml:space="preserve">Everything in one folder</w:t>
+      </w:r>
+    </w:p>
+    <w:p>
+      <w:pPr>
+        <w:pStyle w:val="FirstParagraph"/>
+      </w:pPr>
+      <w:r>
+        <w:t xml:space="preserve">Every deliverable listed below, in a single Drive folder.</w:t>
+      </w:r>
+    </w:p>
+    <w:p>
+      <w:pPr>
+        <w:pStyle w:val="BodyText"/>
+      </w:pPr>
+      <w:r>
+        <w:t xml:space="preserve">https://drive.google.com/drive/folders/1PHvCCxlbwqVEkERlko8-6yZZoImmf0tR</w:t>
+      </w:r>
+    </w:p>
+    <w:p>
+      <w:pPr>
+        <w:pStyle w:val="BodyText"/>
+      </w:pPr>
+      <w:r>
+        <w:t xml:space="preserve">The organised submission set is also here:</w:t>
+      </w:r>
+    </w:p>
+    <w:p>
+      <w:pPr>
+        <w:pStyle w:val="BodyText"/>
+      </w:pPr>
+      <w:r>
+        <w:t xml:space="preserve">https://drive.google.com/drive/folders/1AkWdO5NlaqnFkACs2HIfIl3gmAMfs1w_</w:t>
+      </w:r>
+    </w:p>
     <w:bookmarkEnd w:id="34"/>
-    <w:bookmarkStart w:id="35" w:name="deliverables"/>
+    <w:bookmarkStart w:id="35" w:name="project-report"/>
     <w:p>
       <w:pPr>
         <w:pStyle w:val="Heading2"/>
       </w:pPr>
       <w:r>
-        <w:t xml:space="preserve">Deliverables</w:t>
-      </w:r>
-    </w:p>
-    <w:tbl>
-      <w:tblPr>
-        <w:tblStyle w:val="Table"/>
-        <w:tblW w:type="pct" w:w="5000"/>
-        <w:tblLayout w:type="fixed"/>
-        <w:tblLook w:firstRow="1" w:lastRow="0" w:firstColumn="0" w:lastColumn="0" w:noHBand="0" w:noVBand="0" w:val="0020"/>
-      </w:tblPr>
-      <w:tblGrid>
-        <w:gridCol w:w="2640"/>
-        <w:gridCol w:w="2640"/>
-        <w:gridCol w:w="2640"/>
-      </w:tblGrid>
-      <w:tr>
-        <w:trPr>
-          <w:tblHeader w:val="on"/>
-        </w:trPr>
-        <w:tc>
-          <w:tcPr/>
-          <w:p>
-            <w:pPr>
-              <w:pStyle w:val="Compact"/>
-            </w:pPr>
-            <w:r>
-              <w:t xml:space="preserve">#</w:t>
-            </w:r>
-          </w:p>
-        </w:tc>
-        <w:tc>
-          <w:tcPr/>
-          <w:p>
-            <w:pPr>
-              <w:pStyle w:val="Compact"/>
-            </w:pPr>
-            <w:r>
-              <w:t xml:space="preserve">Deliverable</w:t>
-            </w:r>
-          </w:p>
-        </w:tc>
-        <w:tc>
-          <w:tcPr/>
-          <w:p>
-            <w:pPr>
-              <w:pStyle w:val="Compact"/>
-            </w:pPr>
-            <w:r>
-              <w:t xml:space="preserve">Link</w:t>
-            </w:r>
-          </w:p>
-        </w:tc>
-      </w:tr>
-      <w:tr>
-        <w:tc>
-          <w:tcPr/>
-          <w:p>
-            <w:pPr>
-              <w:pStyle w:val="Compact"/>
-            </w:pPr>
-            <w:r>
-              <w:t xml:space="preserve">1</w:t>
-            </w:r>
-          </w:p>
-        </w:tc>
-        <w:tc>
-          <w:tcPr/>
-          <w:p>
-            <w:pPr>
-              <w:pStyle w:val="Compact"/>
-            </w:pPr>
-            <w:r>
-              <w:t xml:space="preserve">Project report</w:t>
-            </w:r>
-          </w:p>
-        </w:tc>
-        <w:tc>
-          <w:tcPr/>
-          <w:p>
-            <w:pPr>
-              <w:pStyle w:val="Compact"/>
-            </w:pPr>
-            <w:r>
-              <w:t xml:space="preserve">https://docs.google.com/document/d/1uCFz1Chtd9vzwkvGwsplmHHwrbxqLN3k/edit</w:t>
-            </w:r>
-          </w:p>
-        </w:tc>
-      </w:tr>
-      <w:tr>
-        <w:tc>
-          <w:tcPr/>
-          <w:p>
-            <w:pPr>
-              <w:pStyle w:val="Compact"/>
-            </w:pPr>
-            <w:r>
-              <w:t xml:space="preserve">2</w:t>
-            </w:r>
-          </w:p>
-        </w:tc>
-        <w:tc>
-          <w:tcPr/>
-          <w:p>
-            <w:pPr>
-              <w:pStyle w:val="Compact"/>
-            </w:pPr>
-            <w:r>
-              <w:t xml:space="preserve">Project summary (UVP)</w:t>
-            </w:r>
-          </w:p>
-        </w:tc>
-        <w:tc>
-          <w:tcPr/>
-          <w:p>
-            <w:pPr>
-              <w:pStyle w:val="Compact"/>
-            </w:pPr>
-            <w:r>
-              <w:t xml:space="preserve">https://docs.google.com/document/d/1s7br0X-u1Ksc8FhIhuS114E3YNm4lAAv/edit</w:t>
-            </w:r>
-          </w:p>
-        </w:tc>
-      </w:tr>
-      <w:tr>
-        <w:tc>
-          <w:tcPr/>
-          <w:p>
-            <w:pPr>
-              <w:pStyle w:val="Compact"/>
-            </w:pPr>
-            <w:r>
-              <w:t xml:space="preserve">3</w:t>
-            </w:r>
-          </w:p>
-        </w:tc>
-        <w:tc>
-          <w:tcPr/>
-          <w:p>
-            <w:pPr>
-              <w:pStyle w:val="Compact"/>
-            </w:pPr>
-            <w:r>
-              <w:t xml:space="preserve">Source code (zip)</w:t>
-            </w:r>
-          </w:p>
-        </w:tc>
-        <w:tc>
-          <w:tcPr/>
-          <w:p>
-            <w:pPr>
-              <w:pStyle w:val="Compact"/>
-            </w:pPr>
-            <w:r>
-              <w:t xml:space="preserve">https://drive.google.com/file/d/1ehlq9yxDoNkYJL7n24sopvyqKKMbkrek/view</w:t>
-            </w:r>
-          </w:p>
-        </w:tc>
-      </w:tr>
-      <w:tr>
-        <w:tc>
-          <w:tcPr/>
-          <w:p>
-            <w:pPr>
-              <w:pStyle w:val="Compact"/>
-            </w:pPr>
-            <w:r>
-              <w:t xml:space="preserve">4</w:t>
-            </w:r>
-          </w:p>
-        </w:tc>
-        <w:tc>
-          <w:tcPr/>
-          <w:p>
-            <w:pPr>
-              <w:pStyle w:val="Compact"/>
-            </w:pPr>
-            <w:r>
-              <w:t xml:space="preserve">Source code link (txt)</w:t>
-            </w:r>
-          </w:p>
-        </w:tc>
-        <w:tc>
-          <w:tcPr/>
-          <w:p>
-            <w:pPr>
-              <w:pStyle w:val="Compact"/>
-            </w:pPr>
-            <w:r>
-              <w:t xml:space="preserve">https://drive.google.com/file/d/1ZcYxWUTJhNPi-3IOER5B1z3ca-8R5FoK/view</w:t>
-            </w:r>
-          </w:p>
-        </w:tc>
-      </w:tr>
-      <w:tr>
-        <w:tc>
-          <w:tcPr/>
-          <w:p>
-            <w:pPr>
-              <w:pStyle w:val="Compact"/>
-            </w:pPr>
-            <w:r>
-              <w:t xml:space="preserve">5</w:t>
-            </w:r>
-          </w:p>
-        </w:tc>
-        <w:tc>
-          <w:tcPr/>
-          <w:p>
-            <w:pPr>
-              <w:pStyle w:val="Compact"/>
-            </w:pPr>
-            <w:r>
-              <w:t xml:space="preserve">Test and validation report</w:t>
-            </w:r>
-          </w:p>
-        </w:tc>
-        <w:tc>
-          <w:tcPr/>
-          <w:p>
-            <w:pPr>
-              <w:pStyle w:val="Compact"/>
-            </w:pPr>
-            <w:r>
-              <w:t xml:space="preserve">https://docs.google.com/document/d/1Cr-vOzUkfcI7V45BX04mcJ4pwN1Bj3SO/edit</w:t>
-            </w:r>
-          </w:p>
-        </w:tc>
-      </w:tr>
-      <w:tr>
-        <w:tc>
-          <w:tcPr/>
-          <w:p>
-            <w:pPr>
-              <w:pStyle w:val="Compact"/>
-            </w:pPr>
-            <w:r>
-              <w:t xml:space="preserve">6</w:t>
-            </w:r>
-          </w:p>
-        </w:tc>
-        <w:tc>
-          <w:tcPr/>
-          <w:p>
-            <w:pPr>
-              <w:pStyle w:val="Compact"/>
-            </w:pPr>
-            <w:r>
-              <w:t xml:space="preserve">Plagiarism compliance</w:t>
-            </w:r>
-          </w:p>
-        </w:tc>
-        <w:tc>
-          <w:tcPr/>
-          <w:p>
-            <w:pPr>
-              <w:pStyle w:val="Compact"/>
-            </w:pPr>
-            <w:r>
-              <w:t xml:space="preserve">https://docs.google.com/document/d/1r2iAIvEip4R7886QfPbM5USZbxt75YUw/edit</w:t>
-            </w:r>
-          </w:p>
-        </w:tc>
-      </w:tr>
-      <w:tr>
-        <w:tc>
-          <w:tcPr/>
-          <w:p>
-            <w:pPr>
-              <w:pStyle w:val="Compact"/>
-            </w:pPr>
-            <w:r>
-              <w:t xml:space="preserve">7</w:t>
-            </w:r>
-          </w:p>
-        </w:tc>
-        <w:tc>
-          <w:tcPr/>
-          <w:p>
-            <w:pPr>
-              <w:pStyle w:val="Compact"/>
-            </w:pPr>
-            <w:r>
-              <w:t xml:space="preserve">User manual</w:t>
-            </w:r>
-          </w:p>
-        </w:tc>
-        <w:tc>
-          <w:tcPr/>
-          <w:p>
-            <w:pPr>
-              <w:pStyle w:val="Compact"/>
-            </w:pPr>
-            <w:r>
-              <w:t xml:space="preserve">https://docs.google.com/document/d/1IK2LYor9gF934Lim7IuQ-PhOYIxFRxZl/edit</w:t>
-            </w:r>
-          </w:p>
-        </w:tc>
-      </w:tr>
-      <w:tr>
-        <w:tc>
-          <w:tcPr/>
-          <w:p>
-            <w:pPr>
-              <w:pStyle w:val="Compact"/>
-            </w:pPr>
-            <w:r>
-              <w:t xml:space="preserve">8</w:t>
-            </w:r>
-          </w:p>
-        </w:tc>
-        <w:tc>
-          <w:tcPr/>
-          <w:p>
-            <w:pPr>
-              <w:pStyle w:val="Compact"/>
-            </w:pPr>
-            <w:r>
-              <w:t xml:space="preserve">Installation guide</w:t>
-            </w:r>
-          </w:p>
-        </w:tc>
-        <w:tc>
-          <w:tcPr/>
-          <w:p>
-            <w:pPr>
-              <w:pStyle w:val="Compact"/>
-            </w:pPr>
-            <w:r>
-              <w:t xml:space="preserve">https://docs.google.com/document/d/16KTNFEPPu2uhgDu3BRNy9aZH7bbJ-1Bx/edit</w:t>
-            </w:r>
-          </w:p>
-        </w:tc>
-      </w:tr>
-      <w:tr>
-        <w:tc>
-          <w:tcPr/>
-          <w:p>
-            <w:pPr>
-              <w:pStyle w:val="Compact"/>
-            </w:pPr>
-            <w:r>
-              <w:t xml:space="preserve">9</w:t>
-            </w:r>
-          </w:p>
-        </w:tc>
-        <w:tc>
-          <w:tcPr/>
-          <w:p>
-            <w:pPr>
-              <w:pStyle w:val="Compact"/>
-            </w:pPr>
-            <w:r>
-              <w:t xml:space="preserve">Final presentation</w:t>
-            </w:r>
-          </w:p>
-        </w:tc>
-        <w:tc>
-          <w:tcPr/>
-          <w:p>
-            <w:pPr>
-              <w:pStyle w:val="Compact"/>
-            </w:pPr>
-            <w:r>
-              <w:t xml:space="preserve">https://docs.google.com/presentation/d/1_o2Mn7ObgyNLpoNfyrxY4Plo6VTqIEqR/edit</w:t>
-            </w:r>
-          </w:p>
-        </w:tc>
-      </w:tr>
-      <w:tr>
-        <w:tc>
-          <w:tcPr/>
-          <w:p>
-            <w:pPr>
-              <w:pStyle w:val="Compact"/>
-            </w:pPr>
-            <w:r>
-              <w:t xml:space="preserve">10</w:t>
-            </w:r>
-          </w:p>
-        </w:tc>
-        <w:tc>
-          <w:tcPr/>
-          <w:p>
-            <w:pPr>
-              <w:pStyle w:val="Compact"/>
-            </w:pPr>
-            <w:r>
-              <w:t xml:space="preserve">Demo video links (txt)</w:t>
-            </w:r>
-          </w:p>
-        </w:tc>
-        <w:tc>
-          <w:tcPr/>
-          <w:p>
-            <w:pPr>
-              <w:pStyle w:val="Compact"/>
-            </w:pPr>
-            <w:r>
-              <w:t xml:space="preserve">https://drive.google.com/file/d/1EACggpEiJfIX6N0ZaaPggbQgbIcrtE6w/view</w:t>
-            </w:r>
-          </w:p>
-        </w:tc>
-      </w:tr>
-      <w:tr>
-        <w:tc>
-          <w:tcPr/>
-          <w:p>
-            <w:pPr>
-              <w:pStyle w:val="Compact"/>
-            </w:pPr>
-            <w:r>
-              <w:t xml:space="preserve">11</w:t>
-            </w:r>
-          </w:p>
-        </w:tc>
-        <w:tc>
-          <w:tcPr/>
-          <w:p>
-            <w:pPr>
-              <w:pStyle w:val="Compact"/>
-            </w:pPr>
-            <w:r>
-              <w:t xml:space="preserve">Marketing videos</w:t>
-            </w:r>
-          </w:p>
-        </w:tc>
-        <w:tc>
-          <w:tcPr/>
-          <w:p>
-            <w:pPr>
-              <w:pStyle w:val="Compact"/>
-            </w:pPr>
-            <w:r>
-              <w:t xml:space="preserve">Not applicable — outreach was carried out in person through churches and pastors</w:t>
-            </w:r>
-          </w:p>
-        </w:tc>
-      </w:tr>
-      <w:tr>
-        <w:tc>
-          <w:tcPr/>
-          <w:p>
-            <w:pPr>
-              <w:pStyle w:val="Compact"/>
-            </w:pPr>
-            <w:r>
-              <w:t xml:space="preserve">12</w:t>
-            </w:r>
-          </w:p>
-        </w:tc>
-        <w:tc>
-          <w:tcPr/>
-          <w:p>
-            <w:pPr>
-              <w:pStyle w:val="Compact"/>
-            </w:pPr>
-            <w:r>
-              <w:t xml:space="preserve">Social media posters</w:t>
-            </w:r>
-          </w:p>
-        </w:tc>
-        <w:tc>
-          <w:tcPr/>
-          <w:p>
-            <w:pPr>
-              <w:pStyle w:val="Compact"/>
-            </w:pPr>
-            <w:r>
-              <w:t xml:space="preserve">https://drive.google.com/drive/folders/1LtMHra__TWGGbjldHZHUIn5syg27zrTs</w:t>
-            </w:r>
-          </w:p>
-        </w:tc>
-      </w:tr>
-    </w:tbl>
+        <w:t xml:space="preserve">1. Project report</w:t>
+      </w:r>
+    </w:p>
+    <w:p>
+      <w:pPr>
+        <w:pStyle w:val="FirstParagraph"/>
+      </w:pPr>
+      <w:r>
+        <w:t xml:space="preserve">The final documentation. Six chapters covering the problem, the implementation, testing and validation, deployment, execution evidence and conclusions, with twenty-nine figures and five appendices.</w:t>
+      </w:r>
+    </w:p>
+    <w:p>
+      <w:pPr>
+        <w:pStyle w:val="BodyText"/>
+      </w:pPr>
+      <w:r>
+        <w:t xml:space="preserve">https://docs.google.com/document/d/1uCFz1Chtd9vzwkvGwsplmHHwrbxqLN3k/edit</w:t>
+      </w:r>
+    </w:p>
     <w:bookmarkEnd w:id="35"/>
-    <w:bookmarkStart w:id="36" w:name="demonstration-recordings"/>
+    <w:bookmarkStart w:id="36" w:name="project-summary"/>
     <w:p>
       <w:pPr>
         <w:pStyle w:val="Heading2"/>
       </w:pPr>
       <w:r>
-        <w:t xml:space="preserve">Demonstration recordings</w:t>
-      </w:r>
-    </w:p>
-    <w:tbl>
-      <w:tblPr>
-        <w:tblStyle w:val="Table"/>
-        <w:tblW w:type="pct" w:w="5000"/>
-        <w:tblLayout w:type="fixed"/>
-        <w:tblLook w:firstRow="1" w:lastRow="0" w:firstColumn="0" w:lastColumn="0" w:noHBand="0" w:noVBand="0" w:val="0020"/>
-      </w:tblPr>
-      <w:tblGrid>
-        <w:gridCol w:w="3960"/>
-        <w:gridCol w:w="3960"/>
-      </w:tblGrid>
-      <w:tr>
-        <w:trPr>
-          <w:tblHeader w:val="on"/>
-        </w:trPr>
-        <w:tc>
-          <w:tcPr/>
-          <w:p>
-            <w:pPr>
-              <w:pStyle w:val="Compact"/>
-            </w:pPr>
-            <w:r>
-              <w:t xml:space="preserve">Recording</w:t>
-            </w:r>
-          </w:p>
-        </w:tc>
-        <w:tc>
-          <w:tcPr/>
-          <w:p>
-            <w:pPr>
-              <w:pStyle w:val="Compact"/>
-            </w:pPr>
-            <w:r>
-              <w:t xml:space="preserve">Link</w:t>
-            </w:r>
-          </w:p>
-        </w:tc>
-      </w:tr>
-      <w:tr>
-        <w:tc>
-          <w:tcPr/>
-          <w:p>
-            <w:pPr>
-              <w:pStyle w:val="Compact"/>
-            </w:pPr>
-            <w:r>
-              <w:t xml:space="preserve">Application (3 min 50 s)</w:t>
-            </w:r>
-          </w:p>
-        </w:tc>
-        <w:tc>
-          <w:tcPr/>
-          <w:p>
-            <w:pPr>
-              <w:pStyle w:val="Compact"/>
-            </w:pPr>
-            <w:r>
-              <w:t xml:space="preserve">https://drive.google.com/file/d/124faeA_zm2HM7rPP_rWwJPsXSj6iN4QS/view</w:t>
-            </w:r>
-          </w:p>
-        </w:tc>
-      </w:tr>
-      <w:tr>
-        <w:tc>
-          <w:tcPr/>
-          <w:p>
-            <w:pPr>
-              <w:pStyle w:val="Compact"/>
-            </w:pPr>
-            <w:r>
-              <w:t xml:space="preserve">Admin console (1 min 13 s)</w:t>
-            </w:r>
-          </w:p>
-        </w:tc>
-        <w:tc>
-          <w:tcPr/>
-          <w:p>
-            <w:pPr>
-              <w:pStyle w:val="Compact"/>
-            </w:pPr>
-            <w:r>
-              <w:t xml:space="preserve">https://drive.google.com/file/d/1UeTyKBB8uDYdNhWjS14s2lbwYxO7xW6p/view</w:t>
-            </w:r>
-          </w:p>
-        </w:tc>
-      </w:tr>
-    </w:tbl>
+        <w:t xml:space="preserve">2. Project summary</w:t>
+      </w:r>
+    </w:p>
+    <w:p>
+      <w:pPr>
+        <w:pStyle w:val="FirstParagraph"/>
+      </w:pPr>
+      <w:r>
+        <w:t xml:space="preserve">A short overview with the Unique Value Proposition, written to be read before the viva.</w:t>
+      </w:r>
+    </w:p>
+    <w:p>
+      <w:pPr>
+        <w:pStyle w:val="BodyText"/>
+      </w:pPr>
+      <w:r>
+        <w:t xml:space="preserve">https://docs.google.com/document/d/1s7br0X-u1Ksc8FhIhuS114E3YNm4lAAv/edit</w:t>
+      </w:r>
+    </w:p>
     <w:bookmarkEnd w:id="36"/>
-    <w:bookmarkStart w:id="37" w:name="source-code"/>
+    <w:bookmarkStart w:id="37" w:name="source-code-zip"/>
     <w:p>
       <w:pPr>
         <w:pStyle w:val="Heading2"/>
       </w:pPr>
       <w:r>
-        <w:t xml:space="preserve">Source code</w:t>
+        <w:t xml:space="preserve">3. Source code (zip)</w:t>
       </w:r>
     </w:p>
     <w:p>
@@ -734,11 +153,295 @@
         <w:pStyle w:val="FirstParagraph"/>
       </w:pPr>
       <w:r>
+        <w:t xml:space="preserve">The complete codebase as an archive. Credentials and configuration files removed; a security note inside records what was excluded.</w:t>
+      </w:r>
+    </w:p>
+    <w:p>
+      <w:pPr>
+        <w:pStyle w:val="BodyText"/>
+      </w:pPr>
+      <w:r>
+        <w:t xml:space="preserve">https://drive.google.com/file/d/1ehlq9yxDoNkYJL7n24sopvyqKKMbkrek/view</w:t>
+      </w:r>
+    </w:p>
+    <w:bookmarkEnd w:id="37"/>
+    <w:bookmarkStart w:id="38" w:name="source-code-link"/>
+    <w:p>
+      <w:pPr>
+        <w:pStyle w:val="Heading2"/>
+      </w:pPr>
+      <w:r>
+        <w:t xml:space="preserve">4. Source code link</w:t>
+      </w:r>
+    </w:p>
+    <w:p>
+      <w:pPr>
+        <w:pStyle w:val="FirstParagraph"/>
+      </w:pPr>
+      <w:r>
+        <w:t xml:space="preserve">A text file with the GitHub repository URL, the submitted commit, and the commands to run the project.</w:t>
+      </w:r>
+    </w:p>
+    <w:p>
+      <w:pPr>
+        <w:pStyle w:val="BodyText"/>
+      </w:pPr>
+      <w:r>
+        <w:t xml:space="preserve">https://drive.google.com/file/d/1ZcYxWUTJhNPi-3IOER5B1z3ca-8R5FoK/view</w:t>
+      </w:r>
+    </w:p>
+    <w:bookmarkEnd w:id="38"/>
+    <w:bookmarkStart w:id="39" w:name="test-cases-and-validation-report"/>
+    <w:p>
+      <w:pPr>
+        <w:pStyle w:val="Heading2"/>
+      </w:pPr>
+      <w:r>
+        <w:t xml:space="preserve">5. Test cases and validation report</w:t>
+      </w:r>
+    </w:p>
+    <w:p>
+      <w:pPr>
+        <w:pStyle w:val="FirstParagraph"/>
+      </w:pPr>
+      <w:r>
+        <w:t xml:space="preserve">The test plan, all 141 automated test cases, requirement verification, on-device testing and the measured results. Also Chapter 3 of the report.</w:t>
+      </w:r>
+    </w:p>
+    <w:p>
+      <w:pPr>
+        <w:pStyle w:val="BodyText"/>
+      </w:pPr>
+      <w:r>
+        <w:t xml:space="preserve">https://docs.google.com/document/d/1Cr-vOzUkfcI7V45BX04mcJ4pwN1Bj3SO/edit</w:t>
+      </w:r>
+    </w:p>
+    <w:bookmarkEnd w:id="39"/>
+    <w:bookmarkStart w:id="40" w:name="plagiarism-compliance"/>
+    <w:p>
+      <w:pPr>
+        <w:pStyle w:val="Heading2"/>
+      </w:pPr>
+      <w:r>
+        <w:t xml:space="preserve">6. Plagiarism compliance</w:t>
+      </w:r>
+    </w:p>
+    <w:p>
+      <w:pPr>
+        <w:pStyle w:val="FirstParagraph"/>
+      </w:pPr>
+      <w:r>
+        <w:t xml:space="preserve">The originality declaration, a measured overlap self-check, and the provenance of all third-party code and media.</w:t>
+      </w:r>
+    </w:p>
+    <w:p>
+      <w:pPr>
+        <w:pStyle w:val="BodyText"/>
+      </w:pPr>
+      <w:r>
+        <w:t xml:space="preserve">https://docs.google.com/document/d/1r2iAIvEip4R7886QfPbM5USZbxt75YUw/edit</w:t>
+      </w:r>
+    </w:p>
+    <w:bookmarkEnd w:id="40"/>
+    <w:bookmarkStart w:id="41" w:name="user-manual"/>
+    <w:p>
+      <w:pPr>
+        <w:pStyle w:val="Heading2"/>
+      </w:pPr>
+      <w:r>
+        <w:t xml:space="preserve">7. User manual</w:t>
+      </w:r>
+    </w:p>
+    <w:p>
+      <w:pPr>
+        <w:pStyle w:val="FirstParagraph"/>
+      </w:pPr>
+      <w:r>
+        <w:t xml:space="preserve">A guide for someone using the application, illustrated with screenshots. Also Appendix A of the report.</w:t>
+      </w:r>
+    </w:p>
+    <w:p>
+      <w:pPr>
+        <w:pStyle w:val="BodyText"/>
+      </w:pPr>
+      <w:r>
+        <w:t xml:space="preserve">https://docs.google.com/document/d/1IK2LYor9gF934Lim7IuQ-PhOYIxFRxZl/edit</w:t>
+      </w:r>
+    </w:p>
+    <w:bookmarkEnd w:id="41"/>
+    <w:bookmarkStart w:id="42" w:name="installation-guide"/>
+    <w:p>
+      <w:pPr>
+        <w:pStyle w:val="Heading2"/>
+      </w:pPr>
+      <w:r>
+        <w:t xml:space="preserve">8. Installation guide</w:t>
+      </w:r>
+    </w:p>
+    <w:p>
+      <w:pPr>
+        <w:pStyle w:val="FirstParagraph"/>
+      </w:pPr>
+      <w:r>
+        <w:t xml:space="preserve">Prerequisites, database setup, environment variables, running locally, release builds and deployment. Also Appendix B of the report.</w:t>
+      </w:r>
+    </w:p>
+    <w:p>
+      <w:pPr>
+        <w:pStyle w:val="BodyText"/>
+      </w:pPr>
+      <w:r>
+        <w:t xml:space="preserve">https://docs.google.com/document/d/16KTNFEPPu2uhgDu3BRNy9aZH7bbJ-1Bx/edit</w:t>
+      </w:r>
+    </w:p>
+    <w:bookmarkEnd w:id="42"/>
+    <w:bookmarkStart w:id="43" w:name="final-presentation"/>
+    <w:p>
+      <w:pPr>
+        <w:pStyle w:val="Heading2"/>
+      </w:pPr>
+      <w:r>
+        <w:t xml:space="preserve">9. Final presentation</w:t>
+      </w:r>
+    </w:p>
+    <w:p>
+      <w:pPr>
+        <w:pStyle w:val="FirstParagraph"/>
+      </w:pPr>
+      <w:r>
+        <w:t xml:space="preserve">Ten slides on the BITS Capstone 15-minute template, with speaker notes.</w:t>
+      </w:r>
+    </w:p>
+    <w:p>
+      <w:pPr>
+        <w:pStyle w:val="BodyText"/>
+      </w:pPr>
+      <w:r>
+        <w:t xml:space="preserve">https://docs.google.com/presentation/d/1_o2Mn7ObgyNLpoNfyrxY4Plo6VTqIEqR/edit</w:t>
+      </w:r>
+    </w:p>
+    <w:bookmarkEnd w:id="43"/>
+    <w:bookmarkStart w:id="44" w:name="demonstration-videos"/>
+    <w:p>
+      <w:pPr>
+        <w:pStyle w:val="Heading2"/>
+      </w:pPr>
+      <w:r>
+        <w:t xml:space="preserve">10. Demonstration videos</w:t>
+      </w:r>
+    </w:p>
+    <w:p>
+      <w:pPr>
+        <w:pStyle w:val="FirstParagraph"/>
+      </w:pPr>
+      <w:r>
+        <w:t xml:space="preserve">A text file listing both recordings with per-section timestamps.</w:t>
+      </w:r>
+    </w:p>
+    <w:p>
+      <w:pPr>
+        <w:pStyle w:val="BodyText"/>
+      </w:pPr>
+      <w:r>
+        <w:t xml:space="preserve">https://drive.google.com/file/d/1EACggpEiJfIX6N0ZaaPggbQgbIcrtE6w/view</w:t>
+      </w:r>
+    </w:p>
+    <w:p>
+      <w:pPr>
+        <w:pStyle w:val="BodyText"/>
+      </w:pPr>
+      <w:r>
+        <w:t xml:space="preserve">The application walkthrough — sign-in, English and Telugu, the Bible reader, the hymn library, a full voice conversation, the paywall and a live UPI payment.</w:t>
+      </w:r>
+    </w:p>
+    <w:p>
+      <w:pPr>
+        <w:pStyle w:val="BodyText"/>
+      </w:pPr>
+      <w:r>
+        <w:t xml:space="preserve">https://drive.google.com/file/d/124faeA_zm2HM7rPP_rWwJPsXSj6iN4QS/view</w:t>
+      </w:r>
+    </w:p>
+    <w:p>
+      <w:pPr>
+        <w:pStyle w:val="BodyText"/>
+      </w:pPr>
+      <w:r>
+        <w:t xml:space="preserve">The administrative console — live metrics and the per-stage latency breakdown.</w:t>
+      </w:r>
+    </w:p>
+    <w:p>
+      <w:pPr>
+        <w:pStyle w:val="BodyText"/>
+      </w:pPr>
+      <w:r>
+        <w:t xml:space="preserve">https://drive.google.com/file/d/1UeTyKBB8uDYdNhWjS14s2lbwYxO7xW6p/view</w:t>
+      </w:r>
+    </w:p>
+    <w:bookmarkEnd w:id="44"/>
+    <w:bookmarkStart w:id="45" w:name="marketing-videos"/>
+    <w:p>
+      <w:pPr>
+        <w:pStyle w:val="Heading2"/>
+      </w:pPr>
+      <w:r>
+        <w:t xml:space="preserve">11. Marketing videos</w:t>
+      </w:r>
+    </w:p>
+    <w:p>
+      <w:pPr>
+        <w:pStyle w:val="FirstParagraph"/>
+      </w:pPr>
+      <w:r>
+        <w:t xml:space="preserve">Not applicable. Outreach was carried out in person: churches were visited directly and pastors were contacted about the application.</w:t>
+      </w:r>
+    </w:p>
+    <w:bookmarkEnd w:id="45"/>
+    <w:bookmarkStart w:id="46" w:name="social-media-posters"/>
+    <w:p>
+      <w:pPr>
+        <w:pStyle w:val="Heading2"/>
+      </w:pPr>
+      <w:r>
+        <w:t xml:space="preserve">12. Social media posters</w:t>
+      </w:r>
+    </w:p>
+    <w:p>
+      <w:pPr>
+        <w:pStyle w:val="FirstParagraph"/>
+      </w:pPr>
+      <w:r>
+        <w:t xml:space="preserve">Five posters in square, portrait and landscape formats, one of them leading on the Telugu interface.</w:t>
+      </w:r>
+    </w:p>
+    <w:p>
+      <w:pPr>
+        <w:pStyle w:val="BodyText"/>
+      </w:pPr>
+      <w:r>
+        <w:t xml:space="preserve">https://drive.google.com/drive/folders/1LtMHra__TWGGbjldHZHUIn5syg27zrTs</w:t>
+      </w:r>
+    </w:p>
+    <w:bookmarkEnd w:id="46"/>
+    <w:bookmarkStart w:id="47" w:name="source-code-repository"/>
+    <w:p>
+      <w:pPr>
+        <w:pStyle w:val="Heading2"/>
+      </w:pPr>
+      <w:r>
+        <w:t xml:space="preserve">Source code repository</w:t>
+      </w:r>
+    </w:p>
+    <w:p>
+      <w:pPr>
+        <w:pStyle w:val="FirstParagraph"/>
+      </w:pPr>
+      <w:r>
         <w:t xml:space="preserve">https://github.com/manish-gitx/rn-final-manish</w:t>
       </w:r>
     </w:p>
-    <w:bookmarkEnd w:id="37"/>
-    <w:bookmarkEnd w:id="38"/>
+    <w:bookmarkEnd w:id="47"/>
+    <w:bookmarkEnd w:id="48"/>
     <w:sectPr>
       <w:footerReference r:id="rId25" w:type="default"/>
       <w:footnotePr>

</xml_diff>